<commit_message>
Clean up TradingView Pine overlays
</commit_message>
<xml_diff>
--- a/docs/Ali_Swing_Suite_Bullish_Weekly_Participation_v5_Training_Manual.docx
+++ b/docs/Ali_Swing_Suite_Bullish_Weekly_Participation_v5_Training_Manual.docx
@@ -14690,28 +14690,7 @@
         <w:spacing w:after="80" w:line="276" w:lineRule="auto"/>
       </w:pPr>
       <w:r>
-        <w:rPr>
-          <w:rFonts w:ascii="Arial" w:hAnsi="Arial" w:eastAsia="Arial"/>
-          <w:color w:val="000000"/>
-          <w:sz w:val="22"/>
-        </w:rPr>
-        <w:t xml:space="preserve">Confirm the table shows </w:t>
-      </w:r>
-      <w:r>
-        <w:rPr>
-          <w:rFonts w:ascii="Consolas" w:hAnsi="Consolas" w:eastAsia="Consolas"/>
-          <w:color w:val="434343"/>
-          <w:sz w:val="19"/>
-        </w:rPr>
-        <w:t>Research default</w:t>
-      </w:r>
-      <w:r>
-        <w:rPr>
-          <w:rFonts w:ascii="Arial" w:hAnsi="Arial" w:eastAsia="Arial"/>
-          <w:color w:val="000000"/>
-          <w:sz w:val="22"/>
-        </w:rPr>
-        <w:t>.</w:t>
+        <w:t>Confirm the chart contains no labels, badges, or status table.</w:t>
       </w:r>
     </w:p>
     <w:p>
@@ -14725,28 +14704,7 @@
         <w:spacing w:after="80" w:line="276" w:lineRule="auto"/>
       </w:pPr>
       <w:r>
-        <w:rPr>
-          <w:rFonts w:ascii="Arial" w:hAnsi="Arial" w:eastAsia="Arial"/>
-          <w:color w:val="000000"/>
-          <w:sz w:val="22"/>
-        </w:rPr>
-        <w:t xml:space="preserve">Confirm the state never displays a validated </w:t>
-      </w:r>
-      <w:r>
-        <w:rPr>
-          <w:rFonts w:ascii="Consolas" w:hAnsi="Consolas" w:eastAsia="Consolas"/>
-          <w:color w:val="434343"/>
-          <w:sz w:val="19"/>
-        </w:rPr>
-        <w:t>Ready</w:t>
-      </w:r>
-      <w:r>
-        <w:rPr>
-          <w:rFonts w:ascii="Arial" w:hAnsi="Arial" w:eastAsia="Arial"/>
-          <w:color w:val="000000"/>
-          <w:sz w:val="22"/>
-        </w:rPr>
-        <w:t xml:space="preserve"> while the profile is research default.</w:t>
+        <w:t>Use the Data Window for trend, leadership, setup, market, and pattern codes; keep optional pivot and 2R planning lines off unless needed.</w:t>
       </w:r>
     </w:p>
     <w:p>
@@ -14792,12 +14750,7 @@
         <w:spacing w:after="80" w:line="276" w:lineRule="auto"/>
       </w:pPr>
       <w:r>
-        <w:rPr>
-          <w:rFonts w:ascii="Arial" w:hAnsi="Arial" w:eastAsia="Arial"/>
-          <w:color w:val="000000"/>
-          <w:sz w:val="22"/>
-        </w:rPr>
-        <w:t>selected production pattern</w:t>
+        <w:t>selected production-pattern code in the Data Window</w:t>
       </w:r>
     </w:p>
     <w:p>
@@ -14811,12 +14764,7 @@
         <w:spacing w:after="80" w:line="276" w:lineRule="auto"/>
       </w:pPr>
       <w:r>
-        <w:rPr>
-          <w:rFonts w:ascii="Arial" w:hAnsi="Arial" w:eastAsia="Arial"/>
-          <w:color w:val="000000"/>
-          <w:sz w:val="22"/>
-        </w:rPr>
-        <w:t>trigger</w:t>
+        <w:t>short current trigger line</w:t>
       </w:r>
     </w:p>
     <w:p>
@@ -14830,12 +14778,7 @@
         <w:spacing w:after="80" w:line="276" w:lineRule="auto"/>
       </w:pPr>
       <w:r>
-        <w:rPr>
-          <w:rFonts w:ascii="Arial" w:hAnsi="Arial" w:eastAsia="Arial"/>
-          <w:color w:val="000000"/>
-          <w:sz w:val="22"/>
-        </w:rPr>
-        <w:t>structural invalidation</w:t>
+        <w:t>short current structural-invalidation line</w:t>
       </w:r>
     </w:p>
     <w:p>
@@ -14849,12 +14792,7 @@
         <w:spacing w:after="80" w:line="276" w:lineRule="auto"/>
       </w:pPr>
       <w:r>
-        <w:rPr>
-          <w:rFonts w:ascii="Arial" w:hAnsi="Arial" w:eastAsia="Arial"/>
-          <w:color w:val="000000"/>
-          <w:sz w:val="22"/>
-        </w:rPr>
-        <w:t>confirmed pivot</w:t>
+        <w:t>optional current confirmed pivot</w:t>
       </w:r>
     </w:p>
     <w:p>
@@ -14868,12 +14806,7 @@
         <w:spacing w:after="80" w:line="276" w:lineRule="auto"/>
       </w:pPr>
       <w:r>
-        <w:rPr>
-          <w:rFonts w:ascii="Arial" w:hAnsi="Arial" w:eastAsia="Arial"/>
-          <w:color w:val="000000"/>
-          <w:sz w:val="22"/>
-        </w:rPr>
-        <w:t>2R objective</w:t>
+        <w:t>optional current 2R objective</w:t>
       </w:r>
     </w:p>
     <w:p>
@@ -14887,12 +14820,7 @@
         <w:spacing w:after="80" w:line="276" w:lineRule="auto"/>
       </w:pPr>
       <w:r>
-        <w:rPr>
-          <w:rFonts w:ascii="Arial" w:hAnsi="Arial" w:eastAsia="Arial"/>
-          <w:color w:val="000000"/>
-          <w:sz w:val="22"/>
-        </w:rPr>
-        <w:t>market and leadership</w:t>
+        <w:t>market and leadership scores in the Data Window</w:t>
       </w:r>
     </w:p>
     <w:p>
@@ -15016,12 +14944,7 @@
         <w:spacing w:after="80" w:line="276" w:lineRule="auto"/>
       </w:pPr>
       <w:r>
-        <w:rPr>
-          <w:rFonts w:ascii="Arial" w:hAnsi="Arial" w:eastAsia="Arial"/>
-          <w:color w:val="000000"/>
-          <w:sz w:val="22"/>
-        </w:rPr>
-        <w:t>Confirm the timing table recognizes the timeframe.</w:t>
+        <w:t>Confirm the chart contains no labels or timing table.</w:t>
       </w:r>
     </w:p>
     <w:p>
@@ -15035,12 +14958,7 @@
         <w:spacing w:after="80" w:line="276" w:lineRule="auto"/>
       </w:pPr>
       <w:r>
-        <w:rPr>
-          <w:rFonts w:ascii="Arial" w:hAnsi="Arial" w:eastAsia="Arial"/>
-          <w:color w:val="000000"/>
-          <w:sz w:val="22"/>
-        </w:rPr>
-        <w:t>Confirm entry timing appears only inside the entry window.</w:t>
+        <w:t>Use the Data Window for timing score, RSI, MACD histogram, relative volume, and entry-window state.</w:t>
       </w:r>
     </w:p>
     <w:p>
@@ -15054,12 +14972,7 @@
         <w:spacing w:after="80" w:line="276" w:lineRule="auto"/>
       </w:pPr>
       <w:r>
-        <w:rPr>
-          <w:rFonts w:ascii="Arial" w:hAnsi="Arial" w:eastAsia="Arial"/>
-          <w:color w:val="000000"/>
-          <w:sz w:val="22"/>
-        </w:rPr>
-        <w:t>Confirm the final scheduled hour is management-only.</w:t>
+        <w:t>Confirm entry alerts appear only inside the entry window and the final scheduled hour is management-only.</w:t>
       </w:r>
     </w:p>
     <w:p>
@@ -15145,12 +15058,7 @@
         <w:spacing w:after="80" w:line="276" w:lineRule="auto"/>
       </w:pPr>
       <w:r>
-        <w:rPr>
-          <w:rFonts w:ascii="Arial" w:hAnsi="Arial" w:eastAsia="Arial"/>
-          <w:color w:val="000000"/>
-          <w:sz w:val="22"/>
-        </w:rPr>
-        <w:t>distinguish green production labels from context labels</w:t>
+        <w:t>use Data Window pattern, class, and lifecycle codes instead of chart badges</w:t>
       </w:r>
     </w:p>
     <w:p>
@@ -15164,12 +15072,7 @@
         <w:spacing w:after="80" w:line="276" w:lineRule="auto"/>
       </w:pPr>
       <w:r>
-        <w:rPr>
-          <w:rFonts w:ascii="Arial" w:hAnsi="Arial" w:eastAsia="Arial"/>
-          <w:color w:val="000000"/>
-          <w:sz w:val="22"/>
-        </w:rPr>
-        <w:t>inspect selected trigger and invalidation</w:t>
+        <w:t>inspect only the current selected trigger and invalidation; context-only patterns are off by default</w:t>
       </w:r>
     </w:p>
     <w:p>
@@ -16224,28 +16127,7 @@
     </w:tbl>
     <w:p>
       <w:r>
-        <w:rPr>
-          <w:rFonts w:ascii="Arial" w:hAnsi="Arial" w:eastAsia="Arial"/>
-          <w:color w:val="000000"/>
-          <w:sz w:val="22"/>
-        </w:rPr>
-        <w:t xml:space="preserve">TradingView uses the first ten plots as Screener columns and permits no more than five </w:t>
-      </w:r>
-      <w:r>
-        <w:rPr>
-          <w:rFonts w:ascii="Consolas" w:hAnsi="Consolas" w:eastAsia="Consolas"/>
-          <w:color w:val="434343"/>
-          <w:sz w:val="19"/>
-        </w:rPr>
-        <w:t>request.*</w:t>
-      </w:r>
-      <w:r>
-        <w:rPr>
-          <w:rFonts w:ascii="Arial" w:hAnsi="Arial" w:eastAsia="Arial"/>
-          <w:color w:val="000000"/>
-          <w:sz w:val="22"/>
-        </w:rPr>
-        <w:t xml:space="preserve"> calls in the scanned script. The v5 script is designed around those limits.</w:t>
+        <w:t>TradingView uses the first ten plots as Screener columns and permits no more than five request.* calls in the scanned script. The v5 outputs are hidden from the chart and exposed only to Pine Screener and the Data Window. The hourly benchmark is fixed to SPY because Pine Screener ignores symbol-input changes.</w:t>
       </w:r>
     </w:p>
     <w:p>
@@ -16293,12 +16175,7 @@
         <w:keepNext/>
       </w:pPr>
       <w:r>
-        <w:rPr>
-          <w:rFonts w:ascii="Arial" w:hAnsi="Arial" w:eastAsia="Arial"/>
-          <w:color w:val="000000"/>
-          <w:sz w:val="22"/>
-        </w:rPr>
-        <w:t>The tester is labeled:</w:t>
+        <w:t>The tester title retains the warning:</w:t>
       </w:r>
     </w:p>
     <w:p>
@@ -16444,12 +16321,7 @@
     </w:p>
     <w:p>
       <w:r>
-        <w:rPr>
-          <w:rFonts w:ascii="Arial" w:hAnsi="Arial" w:eastAsia="Arial"/>
-          <w:color w:val="000000"/>
-          <w:sz w:val="22"/>
-        </w:rPr>
-        <w:t>Use it only to inspect underlying signal behavior.</w:t>
+        <w:t>The script creates no custom labels or warning table. TradingView built-in strategy trade markers can be hidden through Settings &gt; Style &gt; Trades on chart. Use it only to inspect underlying signal behavior.</w:t>
       </w:r>
     </w:p>
     <w:p>

</xml_diff>

<commit_message>
Harden v5 release workflows
</commit_message>
<xml_diff>
--- a/docs/Ali_Swing_Suite_Bullish_Weekly_Participation_v5_Training_Manual.docx
+++ b/docs/Ali_Swing_Suite_Bullish_Weekly_Participation_v5_Training_Manual.docx
@@ -14617,7 +14617,7 @@
         <w:spacing w:after="80" w:line="276" w:lineRule="auto"/>
       </w:pPr>
       <w:r>
-        <w:t>Confirm the chart contains no labels, badges, or status table.</w:t>
+        <w:t>Confirm the chart contains no labels or historical badges.</w:t>
       </w:r>
     </w:p>
     <w:p>
@@ -14631,7 +14631,7 @@
         <w:spacing w:after="80" w:line="276" w:lineRule="auto"/>
       </w:pPr>
       <w:r>
-        <w:t>Use the Data Window for trend, leadership, setup, market, and pattern codes; keep optional pivot and 2R planning lines off unless needed.</w:t>
+        <w:t>Review the optional DAILY QUICK VIEW table in the top-right corner. Use the Data Window for full trend, leadership, setup, market, and pattern evidence; keep optional pivot and 2R planning lines off unless needed.</w:t>
       </w:r>
     </w:p>
     <w:p>
@@ -14748,6 +14748,134 @@
       </w:pPr>
       <w:r>
         <w:t>market and leadership scores in the Data Window</w:t>
+      </w:r>
+    </w:p>
+    <w:p>
+      <w:pPr>
+        <w:keepNext/>
+      </w:pPr>
+      <w:r>
+        <w:t>Daily quick-view rows:</w:t>
+      </w:r>
+    </w:p>
+    <w:p>
+      <w:pPr>
+        <w:keepNext/>
+        <w:keepLines/>
+        <w:numPr>
+          <w:ilvl w:val="0"/>
+          <w:numId w:val="145"/>
+        </w:numPr>
+        <w:spacing w:after="80" w:line="276" w:lineRule="auto"/>
+      </w:pPr>
+      <w:r>
+        <w:t>State</w:t>
+      </w:r>
+    </w:p>
+    <w:p>
+      <w:pPr>
+        <w:keepNext/>
+        <w:keepLines/>
+        <w:numPr>
+          <w:ilvl w:val="0"/>
+          <w:numId w:val="145"/>
+        </w:numPr>
+        <w:spacing w:after="80" w:line="276" w:lineRule="auto"/>
+      </w:pPr>
+      <w:r>
+        <w:t>Pattern</w:t>
+      </w:r>
+    </w:p>
+    <w:p>
+      <w:pPr>
+        <w:keepNext/>
+        <w:keepLines/>
+        <w:numPr>
+          <w:ilvl w:val="0"/>
+          <w:numId w:val="145"/>
+        </w:numPr>
+        <w:spacing w:after="80" w:line="276" w:lineRule="auto"/>
+      </w:pPr>
+      <w:r>
+        <w:t>Lifecycle and distance from trigger in ATR</w:t>
+      </w:r>
+    </w:p>
+    <w:p>
+      <w:pPr>
+        <w:keepNext/>
+        <w:keepLines/>
+        <w:numPr>
+          <w:ilvl w:val="0"/>
+          <w:numId w:val="145"/>
+        </w:numPr>
+        <w:spacing w:after="80" w:line="276" w:lineRule="auto"/>
+      </w:pPr>
+      <w:r>
+        <w:t>Trend / Setup scores</w:t>
+      </w:r>
+    </w:p>
+    <w:p>
+      <w:pPr>
+        <w:keepNext/>
+        <w:keepLines/>
+        <w:numPr>
+          <w:ilvl w:val="0"/>
+          <w:numId w:val="145"/>
+        </w:numPr>
+        <w:spacing w:after="80" w:line="276" w:lineRule="auto"/>
+      </w:pPr>
+      <w:r>
+        <w:t>Market / Leadership scores</w:t>
+      </w:r>
+    </w:p>
+    <w:p>
+      <w:pPr>
+        <w:keepNext/>
+        <w:keepLines/>
+        <w:numPr>
+          <w:ilvl w:val="0"/>
+          <w:numId w:val="145"/>
+        </w:numPr>
+        <w:spacing w:after="80" w:line="276" w:lineRule="auto"/>
+      </w:pPr>
+      <w:r>
+        <w:t>Trigger</w:t>
+      </w:r>
+    </w:p>
+    <w:p>
+      <w:pPr>
+        <w:keepNext/>
+        <w:keepLines/>
+        <w:numPr>
+          <w:ilvl w:val="0"/>
+          <w:numId w:val="145"/>
+        </w:numPr>
+        <w:spacing w:after="80" w:line="276" w:lineRule="auto"/>
+      </w:pPr>
+      <w:r>
+        <w:t>Structural invalidation</w:t>
+      </w:r>
+    </w:p>
+    <w:p>
+      <w:pPr>
+        <w:keepNext/>
+        <w:keepLines/>
+        <w:numPr>
+          <w:ilvl w:val="0"/>
+          <w:numId w:val="145"/>
+        </w:numPr>
+        <w:spacing w:after="80" w:line="276" w:lineRule="auto"/>
+      </w:pPr>
+      <w:r>
+        <w:t>Next step</w:t>
+      </w:r>
+    </w:p>
+    <w:p>
+      <w:pPr>
+        <w:keepNext/>
+      </w:pPr>
+      <w:r>
+        <w:t>Disable the panel with Settings &gt; Inputs &gt; Show quick insights.</w:t>
       </w:r>
     </w:p>
     <w:p>
@@ -14871,7 +14999,7 @@
         <w:spacing w:after="80" w:line="276" w:lineRule="auto"/>
       </w:pPr>
       <w:r>
-        <w:t>Confirm the chart contains no labels or timing table.</w:t>
+        <w:t>Confirm the chart contains no labels or historical markers.</w:t>
       </w:r>
     </w:p>
     <w:p>
@@ -14885,7 +15013,7 @@
         <w:spacing w:after="80" w:line="276" w:lineRule="auto"/>
       </w:pPr>
       <w:r>
-        <w:t>Use the Data Window for timing score, RSI, MACD histogram, relative volume, and entry-window state.</w:t>
+        <w:t>Review the optional 1H QUICK VIEW table in the top-right corner, then use the Data Window for full timing score, RSI, MACD histogram, relative volume, and entry-window evidence.</w:t>
       </w:r>
     </w:p>
     <w:p>
@@ -14900,6 +15028,14 @@
       </w:pPr>
       <w:r>
         <w:t>Confirm entry alerts appear only inside the entry window and the final scheduled hour is management-only.</w:t>
+      </w:r>
+    </w:p>
+    <w:p>
+      <w:pPr>
+        <w:keepNext/>
+      </w:pPr>
+      <w:r>
+        <w:t>The hourly table summarizes state, timing score, daily/market/window gates, RSI and MACD, relative volume, tactical warning, tactical failure, and the next required action. Disable it with Settings &gt; Inputs &gt; Show quick insights.</w:t>
       </w:r>
     </w:p>
     <w:p>
@@ -15022,6 +15158,20 @@
       </w:r>
     </w:p>
     <w:p>
+      <w:pPr>
+        <w:numPr>
+          <w:ilvl w:val="0"/>
+          <w:numId w:val="147"/>
+        </w:numPr>
+        <w:keepNext/>
+        <w:keepLines/>
+        <w:spacing w:after="80" w:line="276" w:lineRule="auto"/>
+      </w:pPr>
+      <w:r>
+        <w:t>use the optional bottom-right PATTERN QUICK VIEW table for selected pattern, class, lifecycle, distance, trigger, invalidation, and current insight</w:t>
+      </w:r>
+    </w:p>
+    <w:p>
       <w:r>
         <w:rPr>
           <w:rFonts w:ascii="Arial" w:hAnsi="Arial" w:eastAsia="Arial"/>
@@ -15048,7 +15198,7 @@
     <w:p>
       <w:pPr/>
       <w:r>
-        <w:t>Every file uses indicator(). None uses strategy(), Pine Screener output, custom labels, shapes, or tables. The separate Python/HTML research screener is not part of the TradingView package.</w:t>
+        <w:t>Every file uses indicator(). None uses strategy(), Pine Screener output, custom labels, shapes, or historical badges. Each indicator has one optional latest-state table populated only on the chart's last bar. The separate Python/HTML research screener is not part of the TradingView package.</w:t>
       </w:r>
     </w:p>
     <w:p>
@@ -19987,7 +20137,7 @@
     <w:p>
       <w:pPr/>
       <w:r>
-        <w:t>Remove older copies of the indicators, keep optional Daily Command pivot/2R levels and Pattern Atlas context patterns off, use either Daily Command or Pattern Atlas for routine review, and keep Hourly Timing on a separate 60-minute layout.</w:t>
+        <w:t>Remove older copies of the indicators, keep optional Daily Command pivot/2R levels and Pattern Atlas context patterns off, use either Daily Command or Pattern Atlas for routine review, keep Hourly Timing on a separate 60-minute layout, and turn off Show quick insights on any panel that is not needed.</w:t>
       </w:r>
     </w:p>
     <w:p>

</xml_diff>

<commit_message>
Complete v5 reliability audit
</commit_message>
<xml_diff>
--- a/docs/Ali_Swing_Suite_Bullish_Weekly_Participation_v5_Training_Manual.docx
+++ b/docs/Ali_Swing_Suite_Bullish_Weekly_Participation_v5_Training_Manual.docx
@@ -9696,12 +9696,7 @@
     </w:p>
     <w:p>
       <w:r>
-        <w:rPr>
-          <w:rFonts w:ascii="Arial" w:hAnsi="Arial" w:eastAsia="Arial"/>
-          <w:color w:val="000000"/>
-          <w:sz w:val="22"/>
-        </w:rPr>
-        <w:t>Index entries are blocked from the protected morning window through the first completed hour after the scheduled FOMC statement time.</w:t>
+        <w:t>Index entries are blocked from the protected morning window through the first fully completed regular-session hour after the scheduled FOMC statement time. For a 2:00 PM statement, that completed-hour boundary is 3:30 PM ET.</w:t>
       </w:r>
     </w:p>
     <w:p>
@@ -9882,12 +9877,7 @@
     </w:p>
     <w:p>
       <w:r>
-        <w:rPr>
-          <w:rFonts w:ascii="Arial" w:hAnsi="Arial" w:eastAsia="Arial"/>
-          <w:color w:val="000000"/>
-          <w:sz w:val="22"/>
-        </w:rPr>
-        <w:t>Missing or stale evidence is rejected before option-chain retrieval.</w:t>
+        <w:t>Missing, stale, or future-dated evidence is rejected before option-chain retrieval.</w:t>
       </w:r>
     </w:p>
     <w:p>
@@ -19625,6 +19615,20 @@
           <w:sz w:val="22"/>
         </w:rPr>
         <w:t>quote timestamps</w:t>
+      </w:r>
+    </w:p>
+    <w:p>
+      <w:pPr>
+        <w:keepNext/>
+        <w:keepLines/>
+        <w:numPr>
+          <w:ilvl w:val="0"/>
+          <w:numId w:val="185"/>
+        </w:numPr>
+        <w:spacing w:after="80" w:line="276" w:lineRule="auto"/>
+      </w:pPr>
+      <w:r>
+        <w:t>future-dated quote rejection</w:t>
       </w:r>
     </w:p>
     <w:p>

</xml_diff>

<commit_message>
Add Telegram contract research cards
</commit_message>
<xml_diff>
--- a/docs/Ali_Swing_Suite_Bullish_Weekly_Participation_v5_Training_Manual.docx
+++ b/docs/Ali_Swing_Suite_Bullish_Weekly_Participation_v5_Training_Manual.docx
@@ -121,7 +121,7 @@
           <w:color w:val="000000"/>
           <w:sz w:val="22"/>
         </w:rPr>
-        <w:t xml:space="preserve"> July 16, 2026</w:t>
+        <w:t xml:space="preserve"> July 21, 2026</w:t>
       </w:r>
     </w:p>
     <w:p>
@@ -15717,6 +15717,115 @@
           <w:sz w:val="22"/>
         </w:rPr>
         <w:t>test on SPY, QQQ, and a representative leader</w:t>
+      </w:r>
+    </w:p>
+    <w:p>
+      <w:pPr>
+        <w:pStyle w:val="Heading1"/>
+      </w:pPr>
+      <w:r>
+        <w:t>16.5 Telegram Contract Research Cards</w:t>
+      </w:r>
+    </w:p>
+    <w:p>
+      <w:pPr/>
+      <w:r>
+        <w:t>Telegram receives the market digest first. Ready, Ready - Verify, and Verify Contract candidates can then receive chart-backed research cards, up to the configured card limit. Developing candidates remain in a compact watchlist.</w:t>
+      </w:r>
+    </w:p>
+    <w:p>
+      <w:pPr/>
+      <w:r>
+        <w:t>A full card identifies:</w:t>
+      </w:r>
+    </w:p>
+    <w:p>
+      <w:pPr>
+        <w:numPr>
+          <w:ilvl w:val="0"/>
+          <w:numId w:val="156"/>
+        </w:numPr>
+      </w:pPr>
+      <w:r>
+        <w:t>symbol, lane, state, pattern, underlying price, and trigger</w:t>
+      </w:r>
+    </w:p>
+    <w:p>
+      <w:pPr>
+        <w:numPr>
+          <w:ilvl w:val="0"/>
+          <w:numId w:val="156"/>
+        </w:numPr>
+      </w:pPr>
+      <w:r>
+        <w:t>primary call strike, expiration, DTE, delta, bid/ask, spread, open interest, and volume</w:t>
+      </w:r>
+    </w:p>
+    <w:p>
+      <w:pPr>
+        <w:numPr>
+          <w:ilvl w:val="0"/>
+          <w:numId w:val="156"/>
+        </w:numPr>
+      </w:pPr>
+      <w:r>
+        <w:t>up to two alternative strike/expiration pairs</w:t>
+      </w:r>
+    </w:p>
+    <w:p>
+      <w:pPr>
+        <w:numPr>
+          <w:ilvl w:val="0"/>
+          <w:numId w:val="156"/>
+        </w:numPr>
+      </w:pPr>
+      <w:r>
+        <w:t>TP1 and a distinct TP2 when the 2R objective is above TP1</w:t>
+      </w:r>
+    </w:p>
+    <w:p>
+      <w:pPr>
+        <w:numPr>
+          <w:ilvl w:val="0"/>
+          <w:numId w:val="156"/>
+        </w:numPr>
+      </w:pPr>
+      <w:r>
+        <w:t>tactical failure and structural invalidation</w:t>
+      </w:r>
+    </w:p>
+    <w:p>
+      <w:pPr>
+        <w:numPr>
+          <w:ilvl w:val="0"/>
+          <w:numId w:val="156"/>
+        </w:numPr>
+      </w:pPr>
+      <w:r>
+        <w:t>intended hold and DTE requalification boundary</w:t>
+      </w:r>
+    </w:p>
+    <w:p>
+      <w:pPr>
+        <w:numPr>
+          <w:ilvl w:val="0"/>
+          <w:numId w:val="156"/>
+        </w:numPr>
+      </w:pPr>
+      <w:r>
+        <w:t>event status and data trust</w:t>
+      </w:r>
+    </w:p>
+    <w:p>
+      <w:pPr/>
+      <w:r>
+        <w:t>When the refreshed contract has a stable, current OPRA quote, the card also displays an estimated option-premium range at each underlying objective. The immediate end starts from the ask and applies the current delta plus optional gamma response. The delayed end starts from the bid and also applies theta through the lane maximum hold. Estimates are floored at intrinsic value and zero.</w:t>
+      </w:r>
+    </w:p>
+    <w:p>
+      <w:pPr/>
+      <w:r>
+        <w:t>The estimate assumes implied volatility remains stable. It is a quote-anchored scenario, not a forecast, guaranteed take-profit price, or instruction to trade. Missing, stale, unstable, invalid, or non-OPRA evidence displays live OPRA verification required instead of a premium estimate. A long call can still lose the full premium paid.</w:t>
       </w:r>
     </w:p>
     <w:p>

</xml_diff>